<commit_message>
Implement rolling Top K and benchmark indexing
</commit_message>
<xml_diff>
--- a/docs/D2/D2_QueCay.docx
+++ b/docs/D2/D2_QueCay.docx
@@ -548,11 +548,7 @@
         </w:rPr>
       </w:pPr>
       <w:r>
-        <w:rPr>
-          <w:sz w:val="24"/>
-          <w:szCs w:val="24"/>
-        </w:rPr>
-        <w:t>Hệ thống cho phép tra cứu chính xác một bản ghi dựa trên một mã định danh (identifier), áp dụng cho ba loại đối tượng:</w:t>
+        <w:t>Trong phạm vi MC1 mà nhóm lựa chọn để phân tích, cài đặt và đo hiệu năng, hệ thống tra cứu chính xác một đầu sách theo mã bookId. Các tra cứu thành viên và phiếu mượn vẫn phục vụ nghiệp vụ, nhưng không được tính là phạm vi MC1 và không được dùng để tuyên bố đã tối ưu/đo MC1.</w:t>
       </w:r>
     </w:p>
     <w:p>
@@ -569,11 +565,7 @@
         </w:rPr>
       </w:pPr>
       <w:r>
-        <w:rPr>
-          <w:sz w:val="24"/>
-          <w:szCs w:val="24"/>
-        </w:rPr>
-        <w:t>Tra cứu tài liệu: nhập mã tài liệu để tìm thông tin một đầu sách cụ thể.</w:t>
+        <w:t>Tra cứu đầu sách: nhập bookId để nhận đúng thông tin một đầu sách hoặc thông báo không tìm thấy.</w:t>
       </w:r>
     </w:p>
     <w:p>
@@ -590,11 +582,7 @@
         </w:rPr>
       </w:pPr>
       <w:r>
-        <w:rPr>
-          <w:sz w:val="24"/>
-          <w:szCs w:val="24"/>
-        </w:rPr>
-        <w:t>Tra cứu thành viên: nhập mã thành viên để tìm hồ sơ thành viên.</w:t>
+        <w:t>Tra cứu thành viên theo memberId vẫn có trong luồng nghiệp vụ, nhưng nằm ngoài phạm vi MC1 đã chọn.</w:t>
       </w:r>
     </w:p>
     <w:p>
@@ -611,27 +599,19 @@
         </w:rPr>
       </w:pPr>
       <w:r>
-        <w:rPr>
-          <w:sz w:val="24"/>
-          <w:szCs w:val="24"/>
-        </w:rPr>
-        <w:t>Tra cứu phiếu mượn: nhập mã phiếu để tìm thông tin một giao dịch cụ thể.</w:t>
-      </w:r>
-    </w:p>
-    <w:p>
-      <w:pPr>
-        <w:spacing w:after="120"/>
-        <w:rPr>
-          <w:sz w:val="24"/>
-          <w:szCs w:val="24"/>
-        </w:rPr>
-      </w:pPr>
-      <w:r>
-        <w:rPr>
-          <w:sz w:val="24"/>
-          <w:szCs w:val="24"/>
-        </w:rPr>
-        <w:t>Ví dụ: nhập mã thành viên 10235 → hệ thống trả về đúng hồ sơ của thành viên đó. Điểm quan trọng của MC1 là tìm một đối tượng cụ thể theo khóa, không phải lấy ra toàn bộ danh sách hay tìm theo khoảng giá trị.</w:t>
+        <w:t>Tra cứu phiếu mượn theo loanId vẫn có trong luồng nghiệp vụ, nhưng nằm ngoài phạm vi MC1 đã chọn.</w:t>
+      </w:r>
+    </w:p>
+    <w:p>
+      <w:pPr>
+        <w:spacing w:after="120"/>
+        <w:rPr>
+          <w:sz w:val="24"/>
+          <w:szCs w:val="24"/>
+        </w:rPr>
+      </w:pPr>
+      <w:r>
+        <w:t>Ví dụ: nhập bookId B10235 → hệ thống trả về đúng đầu sách đó hoặc báo không tìm thấy. MC1 tập trung vào tìm một đối tượng theo khóa, không lấy toàn bộ danh sách hay tìm theo khoảng giá trị.</w:t>
       </w:r>
     </w:p>
     <w:p>
@@ -693,11 +673,7 @@
         </w:rPr>
       </w:pPr>
       <w:r>
-        <w:rPr>
-          <w:sz w:val="24"/>
-          <w:szCs w:val="24"/>
-        </w:rPr>
-        <w:t>Hỗ trợ trực tiếp nghiệp vụ mượn/trả: khi thành viên cung cấp mã thẻ, hệ thống lấy ngay thông tin cần thiết.</w:t>
+        <w:t>Hỗ trợ trực tiếp thao tác tra cứu đầu sách theo bookId trong quy mô lớn.</w:t>
       </w:r>
     </w:p>
     <w:p>
@@ -714,12 +690,7 @@
         </w:rPr>
       </w:pPr>
       <w:r>
-        <w:rPr>
-          <w:sz w:val="24"/>
-          <w:szCs w:val="24"/>
-        </w:rPr>
-        <w:lastRenderedPageBreak/>
-        <w:t>Là nền tảng cho mọi thao tác khác — mượn, trả, gia hạn, đặt chỗ — đều cần tra cứu đúng bản ghi trước khi thực hiện; nếu bước này chậm, toàn hệ thống chậm theo.</w:t>
+        <w:t>Phạm vi hiệu năng được cam kết ở đây chỉ là tra cứu đầu sách theo bookId; không suy rộng kết quả benchmark sang tra cứu memberId hoặc loanId.</w:t>
       </w:r>
     </w:p>
     <w:p>
@@ -1651,11 +1622,7 @@
         </w:rPr>
       </w:pPr>
       <w:r>
-        <w:rPr>
-          <w:sz w:val="24"/>
-          <w:szCs w:val="24"/>
-        </w:rPr>
-        <w:t>Giới hạn đúng K bản ghi giúp chi phí lưu trữ cho chức năng này không tăng theo tổng số giao dịch của thư viện.</w:t>
+        <w:t>Hệ thống giữ tối đa 1.000 hoạt động mới nhất để dung lượng lưu trữ không tăng theo toàn bộ lịch sử giao dịch. Khi xem, thủ thư có thể yêu cầu tối đa K hoạt động, với K không vượt quá giới hạn này.</w:t>
       </w:r>
     </w:p>
     <w:p>
@@ -1685,11 +1652,7 @@
         </w:rPr>
       </w:pPr>
       <w:r>
-        <w:rPr>
-          <w:sz w:val="24"/>
-          <w:szCs w:val="24"/>
-        </w:rPr>
-        <w:t>Thay vì quét và sắp xếp lại toàn bộ lịch sử giao dịch mỗi khi cần xem, hệ thống duy trì một danh sách có dung lượng giới hạn đúng K phần tử: khi có giao dịch mới, chèn vào đầu danh sách; nếu vượt quá K, tự động loại bỏ phần tử cũ nhất ở cuối. Khi cần xem, hệ thống chỉ duyệt trực tiếp trên danh sách giới hạn này.</w:t>
+        <w:t>Thay vì giữ toàn bộ lịch sử trong bộ nhớ, hệ thống duy trì tối đa 1.000 hoạt động mới nhất theo thứ tự thời gian. Khi có hoạt động mới, nếu danh sách vượt giới hạn thì loại bỏ hoạt động cũ nhất. Khi xem, thủ thư lấy tối đa K phần tử từ cuối mới nhất trở về trước; phần lịch sử cũ hơn giới hạn không thuộc phạm vi chức năng.</w:t>
       </w:r>
     </w:p>
     <w:p>

</xml_diff>